<commit_message>
Rewrite submission docs in first-person project-specific wording.
Co-authored-by: Cursor <cursoragent@cursor.com>
</commit_message>
<xml_diff>
--- a/SUBMISSION.docx
+++ b/SUBMISSION.docx
@@ -7,27 +7,27 @@
         <w:pStyle w:val="Heading1"/>
       </w:pPr>
       <w:r>
-        <w:t>PII Redaction Tool — how I built this (and what actually works)</w:t>
+        <w:t>PII Redaction Tool — my submission notes</w:t>
       </w:r>
     </w:p>
     <w:p>
       <w:r>
-        <w:t>Author: Kartikeya Mishra</w:t>
+        <w:t>Kartikeya Mishra</w:t>
       </w:r>
     </w:p>
     <w:p>
       <w:r>
-        <w:t>Repo: https://github.com/KartikeyaM2007/Redact-scaler</w:t>
+        <w:t>GitHub: https://github.com/KartikeyaM2007/Redact-scaler</w:t>
       </w:r>
     </w:p>
     <w:p>
       <w:r>
-        <w:t>Live demo (Rules only): https://huggingface.co/spaces/Kartikeym2007/Redact</w:t>
+        <w:t>Try Rules online: https://huggingface.co/spaces/Kartikeym2007/Redact</w:t>
       </w:r>
     </w:p>
     <w:p>
       <w:r>
-        <w:t>This is my write-up for the Scaler PII Redaction assignment. I'm keeping it straight: what the tool does, how Rules vs ML/NER differ, why the live Space can't flip to ML, and what the numbers actually mean.</w:t>
+        <w:t>I'm submitting this for the Scaler AI Labs PII redaction task. Below is how I solved it — not a generic tutorial rewrite.</w:t>
       </w:r>
     </w:p>
     <w:p>
@@ -35,17 +35,17 @@
         <w:pStyle w:val="Heading2"/>
       </w:pPr>
       <w:r>
-        <w:t>What the tool does</w:t>
+        <w:t>The job, in my words</w:t>
       </w:r>
     </w:p>
     <w:p>
       <w:r>
-        <w:t>You give it a .docx. It finds PII and replaces each value with a fake but realistic stand-in (same fake every time that value shows up again in the same run). Output is another .docx you can open in Word.</w:t>
+        <w:t>I needed a script that reads a Word file full of personal data (they gave a Red Herring Prospectus; the same code also works on ticket-style docs) and writes a second .docx where real PII is swapped for fake but believable values. Masking with **** wasn't the ask — they wanted stand-ins like a fake name/email so the doc still looks readable.</w:t>
       </w:r>
     </w:p>
     <w:p>
       <w:r>
-        <w:t>Minimum categories covered:</w:t>
+        <w:t>I cover at least:</w:t>
       </w:r>
     </w:p>
     <w:p>
@@ -53,7 +53,7 @@
         <w:pStyle w:val="ListBullet"/>
       </w:pPr>
       <w:r>
-        <w:t>full names</w:t>
+        <w:t>names</w:t>
       </w:r>
     </w:p>
     <w:p>
@@ -77,7 +77,7 @@
         <w:pStyle w:val="ListBullet"/>
       </w:pPr>
       <w:r>
-        <w:t>company names</w:t>
+        <w:t>companies</w:t>
       </w:r>
     </w:p>
     <w:p>
@@ -101,7 +101,7 @@
         <w:pStyle w:val="ListBullet"/>
       </w:pPr>
       <w:r>
-        <w:t>credit cards (Luhn check)</w:t>
+        <w:t>cards (I check Luhn so random digit noise doesn't get wiped)</w:t>
       </w:r>
     </w:p>
     <w:p>
@@ -109,7 +109,7 @@
         <w:pStyle w:val="ListBullet"/>
       </w:pPr>
       <w:r>
-        <w:t>dates of birth</w:t>
+        <w:t>DOBs</w:t>
       </w:r>
     </w:p>
     <w:p>
@@ -117,22 +117,22 @@
         <w:pStyle w:val="ListBullet"/>
       </w:pPr>
       <w:r>
-        <w:t>IP addresses</w:t>
+        <w:t>IPs</w:t>
       </w:r>
     </w:p>
     <w:p>
       <w:r>
-        <w:t>Main script: redact_pii.py</w:t>
+        <w:t>Core file: redact_pii.py</w:t>
       </w:r>
     </w:p>
     <w:p>
       <w:r>
-        <w:t>Redacted assignment output: Red Herring Prospectus - Redacted.docx</w:t>
+        <w:t>My redacted prospectus: Red Herring Prospectus - Redacted.docx</w:t>
       </w:r>
     </w:p>
     <w:p>
       <w:r>
-        <w:t>Local UI: web_app.py + web/</w:t>
+        <w:t>Optional UI when I'm testing modes: web_app.py</w:t>
       </w:r>
     </w:p>
     <w:p>
@@ -140,12 +140,12 @@
         <w:pStyle w:val="Heading2"/>
       </w:pPr>
       <w:r>
-        <w:t>Rules vs ML / NER (the important bit)</w:t>
+        <w:t>How detection works (two modes)</w:t>
       </w:r>
     </w:p>
     <w:p>
       <w:r>
-        <w:t>I didn't force everything through one fancy model. There are two modes on purpose.</w:t>
+        <w:t>I didn't bet everything on one approach.</w:t>
       </w:r>
     </w:p>
     <w:p>
@@ -153,17 +153,12 @@
         <w:pStyle w:val="Heading3"/>
       </w:pPr>
       <w:r>
-        <w:t>1) Rules mode</w:t>
+        <w:t>Rules</w:t>
       </w:r>
     </w:p>
     <w:p>
       <w:r>
-        <w:t>Regex + a bit of context ("Contact Person: …", "DOB: …", table label/value pairs, company suffixes like Ltd / LLC, etc.).</w:t>
-      </w:r>
-    </w:p>
-    <w:p>
-      <w:r>
-        <w:t>This is the reliable baseline for structured stuff: emails, phones, SSNs, cards, labelled DOBs, IPs. It's deterministic and easy to debug. If something weird gets redacted, I can usually point at the pattern.</w:t>
+        <w:t>Regexes plus labels I care about (Contact Person, DOB, Registered Office, Ltd/LLC-style company endings, adjacent table cells that look like label → value). This is what I trust for emails, phones, SSN patterns, cards, IPs, labelled dates. When something gets replaced, I can usually explain why.</w:t>
       </w:r>
     </w:p>
     <w:p>
@@ -171,22 +166,17 @@
         <w:pStyle w:val="Heading3"/>
       </w:pPr>
       <w:r>
-        <w:t>2) Hybrid ML / NER mode</w:t>
+        <w:t>Hybrid (ML / NER)</w:t>
       </w:r>
     </w:p>
     <w:p>
       <w:r>
-        <w:t>Same rules plus spaCy en_core_web_sm.</w:t>
+        <w:t>Keep those rules, then run spaCy's en_core_web_sm on top. I added this because plain rules ignore names/companies sitting in normal sentences with no Name: prefix. My check file has Alice Johnson, Robert Chen, and Microsoft in prose. Rules only clean the email/phone. Hybrid also hits the three unlabelled ones. That's what ml_ner_test.py is for — so nobody thinks the UI toggle is fake.</w:t>
       </w:r>
     </w:p>
     <w:p>
       <w:r>
-        <w:t>Why bother? Rules miss people and companies that show up as normal prose with no label. Example fixture: "Alice Johnson" / "Robert Chen" / "Microsoft" with no "Name:" in front. Rules leave them. Hybrid catches them.</w:t>
-      </w:r>
-    </w:p>
-    <w:p>
-      <w:r>
-        <w:t>That's not marketing fluff — ml_ner_test.py checks it:</w:t>
+        <w:t>Same fake for the same original value inside one run (hash-based mapping). I don't ship the mapping file; that would leak the originals.</w:t>
       </w:r>
     </w:p>
     <w:tbl>
@@ -216,7 +206,7 @@
           </w:tcPr>
           <w:p>
             <w:r>
-              <w:t>What got redacted</w:t>
+              <w:t>On my ML fixture</w:t>
             </w:r>
           </w:p>
         </w:tc>
@@ -238,7 +228,7 @@
           </w:tcPr>
           <w:p>
             <w:r>
-              <w:t>email + phone only (2)</w:t>
+              <w:t>email + phone (2)</w:t>
             </w:r>
           </w:p>
         </w:tc>
@@ -271,12 +261,12 @@
         <w:pStyle w:val="Heading3"/>
       </w:pPr>
       <w:r>
-        <w:t>Local UI screenshots</w:t>
+        <w:t>Screens from my local UI</w:t>
       </w:r>
     </w:p>
     <w:p>
       <w:r>
-        <w:t>Rules — structured contact fields go; unlabelled prose names stay:</w:t>
+        <w:t>Rules run (structured fields go; loose prose names stay):</w:t>
       </w:r>
     </w:p>
     <w:p>
@@ -320,7 +310,7 @@
     </w:p>
     <w:p>
       <w:r>
-        <w:t>ML / NER — same run, but spaCy also hits the unlabelled people/org:</w:t>
+        <w:t>Hybrid run (spaCy picks up the loose names/org too):</w:t>
       </w:r>
     </w:p>
     <w:p>
@@ -363,26 +353,21 @@
       </w:r>
     </w:p>
     <w:p>
-      <w:r>
-        <w:t>If you only look at the live Hugging Face link and wonder why ML is greyed out, next section is for you.</w:t>
-      </w:r>
-    </w:p>
-    <w:p>
       <w:pPr>
         <w:pStyle w:val="Heading2"/>
       </w:pPr>
       <w:r>
-        <w:t>Why the live Hugging Face demo has ML disabled</w:t>
+        <w:t>Live demo vs local (don't get confused)</w:t>
       </w:r>
     </w:p>
     <w:p>
       <w:r>
-        <w:t>Short version: the free Space is static (HTML/JS in the browser). spaCy is Python. Free Hugging Face Gradio/Docker hosting wants PRO now, and the free PaaS attempts (Render) choked on Python version / RAM for a fat prospectus + spaCy.</w:t>
+        <w:t>The Hugging Face link is a static Space. Browser only. No Python, so no spaCy there. I tried free Gradio/Docker on HF — that needs PRO now. I also tried Render; build/RAM issues on the big prospectus weren't worth fighting for a free host.</w:t>
       </w:r>
     </w:p>
     <w:p>
       <w:r>
-        <w:t>So I stopped pretending and left the live demo honest:</w:t>
+        <w:t>So the live page shows Rules, and ML is intentionally off. I'm not labelling it as "full ML online" when it isn't.</w:t>
       </w:r>
     </w:p>
     <w:p>
@@ -425,11 +410,21 @@
       </w:r>
     </w:p>
     <w:p>
+      <w:r>
+        <w:t>To actually flip Rules ↔ ML: pip install -r requirements.txt then python web_app.py</w:t>
+      </w:r>
+    </w:p>
+    <w:p>
+      <w:r>
+        <w:t>Or CLI: python redact_pii.py --mode hybrid in.docx out.docx</w:t>
+      </w:r>
+    </w:p>
+    <w:p>
       <w:pPr>
-        <w:pStyle w:val="ListBullet"/>
+        <w:pStyle w:val="Heading2"/>
       </w:pPr>
       <w:r>
-        <w:t>Live Space = browser Rules demo (good enough to try a DOCX online)</w:t>
+        <w:t>Libraries I used</w:t>
       </w:r>
     </w:p>
     <w:p>
@@ -437,32 +432,28 @@
         <w:pStyle w:val="ListBullet"/>
       </w:pPr>
       <w:r>
-        <w:t>Local app / CLI = real Rules and spaCy ML/NER</w:t>
+        <w:t>python-docx — read/write the Word structure</w:t>
+      </w:r>
+    </w:p>
+    <w:p>
+      <w:pPr>
+        <w:pStyle w:val="ListBullet"/>
+      </w:pPr>
+      <w:r>
+        <w:t>regex / context rules — structured PII</w:t>
+      </w:r>
+    </w:p>
+    <w:p>
+      <w:pPr>
+        <w:pStyle w:val="ListBullet"/>
+      </w:pPr>
+      <w:r>
+        <w:t>spaCy + en_core_web_sm — extra PERSON/ORG recall in hybrid</w:t>
       </w:r>
     </w:p>
     <w:p>
       <w:r>
-        <w:t>I'm not going to call the static Space "full ML" when it isn't. Local is where the NER switch actually runs.</w:t>
-      </w:r>
-    </w:p>
-    <w:p>
-      <w:r>
-        <w:t>python -m pip install -r requirements.txt</w:t>
-      </w:r>
-    </w:p>
-    <w:p>
-      <w:r>
-        <w:t>python web_app.py</w:t>
-      </w:r>
-    </w:p>
-    <w:p>
-      <w:r>
-        <w:t># open http://127.0.0.1:8000/ and pick Rules or ML / NER</w:t>
-      </w:r>
-    </w:p>
-    <w:p>
-      <w:r>
-        <w:t>CLI hybrid: python redact_pii.py --mode hybrid "input.docx" "redacted.docx"</w:t>
+        <w:t>That's it for the engine. No giant LLM API in the loop.</w:t>
       </w:r>
     </w:p>
     <w:p>
@@ -470,192 +461,7 @@
         <w:pStyle w:val="Heading2"/>
       </w:pPr>
       <w:r>
-        <w:t>Approach / libraries</w:t>
-      </w:r>
-    </w:p>
-    <w:tbl>
-      <w:tblPr>
-        <w:tblStyle w:val="TableGrid"/>
-        <w:tblW w:type="auto" w:w="0"/>
-        <w:tblLook w:firstColumn="1" w:firstRow="1" w:lastColumn="0" w:lastRow="0" w:noHBand="0" w:noVBand="1" w:val="04A0"/>
-      </w:tblPr>
-      <w:tblGrid>
-        <w:gridCol w:w="2880"/>
-        <w:gridCol w:w="2880"/>
-        <w:gridCol w:w="2880"/>
-      </w:tblGrid>
-      <w:tr>
-        <w:tc>
-          <w:tcPr>
-            <w:tcW w:type="dxa" w:w="2880"/>
-          </w:tcPr>
-          <w:p>
-            <w:r>
-              <w:t>Piece</w:t>
-            </w:r>
-          </w:p>
-        </w:tc>
-        <w:tc>
-          <w:tcPr>
-            <w:tcW w:type="dxa" w:w="2880"/>
-          </w:tcPr>
-          <w:p>
-            <w:r>
-              <w:t>Choice</w:t>
-            </w:r>
-          </w:p>
-        </w:tc>
-        <w:tc>
-          <w:tcPr>
-            <w:tcW w:type="dxa" w:w="2880"/>
-          </w:tcPr>
-          <w:p>
-            <w:r>
-              <w:t>Why</w:t>
-            </w:r>
-          </w:p>
-        </w:tc>
-      </w:tr>
-      <w:tr>
-        <w:tc>
-          <w:tcPr>
-            <w:tcW w:type="dxa" w:w="2880"/>
-          </w:tcPr>
-          <w:p>
-            <w:r>
-              <w:t>DOCX I/O</w:t>
-            </w:r>
-          </w:p>
-        </w:tc>
-        <w:tc>
-          <w:tcPr>
-            <w:tcW w:type="dxa" w:w="2880"/>
-          </w:tcPr>
-          <w:p>
-            <w:r>
-              <w:t>python-docx</w:t>
-            </w:r>
-          </w:p>
-        </w:tc>
-        <w:tc>
-          <w:tcPr>
-            <w:tcW w:type="dxa" w:w="2880"/>
-          </w:tcPr>
-          <w:p>
-            <w:r>
-              <w:t>Keeps paragraphs/tables/headers usable</w:t>
-            </w:r>
-          </w:p>
-        </w:tc>
-      </w:tr>
-      <w:tr>
-        <w:tc>
-          <w:tcPr>
-            <w:tcW w:type="dxa" w:w="2880"/>
-          </w:tcPr>
-          <w:p>
-            <w:r>
-              <w:t>Structured PII</w:t>
-            </w:r>
-          </w:p>
-        </w:tc>
-        <w:tc>
-          <w:tcPr>
-            <w:tcW w:type="dxa" w:w="2880"/>
-          </w:tcPr>
-          <w:p>
-            <w:r>
-              <w:t>regex + context labels</w:t>
-            </w:r>
-          </w:p>
-        </w:tc>
-        <w:tc>
-          <w:tcPr>
-            <w:tcW w:type="dxa" w:w="2880"/>
-          </w:tcPr>
-          <w:p>
-            <w:r>
-              <w:t>Predictable for emails, phones, SSN, card, IP, labelled DOB</w:t>
-            </w:r>
-          </w:p>
-        </w:tc>
-      </w:tr>
-      <w:tr>
-        <w:tc>
-          <w:tcPr>
-            <w:tcW w:type="dxa" w:w="2880"/>
-          </w:tcPr>
-          <w:p>
-            <w:r>
-              <w:t>Extra names/orgs</w:t>
-            </w:r>
-          </w:p>
-        </w:tc>
-        <w:tc>
-          <w:tcPr>
-            <w:tcW w:type="dxa" w:w="2880"/>
-          </w:tcPr>
-          <w:p>
-            <w:r>
-              <w:t>spaCy en_core_web_sm</w:t>
-            </w:r>
-          </w:p>
-        </w:tc>
-        <w:tc>
-          <w:tcPr>
-            <w:tcW w:type="dxa" w:w="2880"/>
-          </w:tcPr>
-          <w:p>
-            <w:r>
-              <w:t>Extra recall in unlabelled prose</w:t>
-            </w:r>
-          </w:p>
-        </w:tc>
-      </w:tr>
-      <w:tr>
-        <w:tc>
-          <w:tcPr>
-            <w:tcW w:type="dxa" w:w="2880"/>
-          </w:tcPr>
-          <w:p>
-            <w:r>
-              <w:t>UI</w:t>
-            </w:r>
-          </w:p>
-        </w:tc>
-        <w:tc>
-          <w:tcPr>
-            <w:tcW w:type="dxa" w:w="2880"/>
-          </w:tcPr>
-          <w:p>
-            <w:r>
-              <w:t>tiny local HTTP UI</w:t>
-            </w:r>
-          </w:p>
-        </w:tc>
-        <w:tc>
-          <w:tcPr>
-            <w:tcW w:type="dxa" w:w="2880"/>
-          </w:tcPr>
-          <w:p>
-            <w:r>
-              <w:t>Switch modes, preview, download</w:t>
-            </w:r>
-          </w:p>
-        </w:tc>
-      </w:tr>
-    </w:tbl>
-    <w:p>
-      <w:r>
-        <w:t>Replacements are hashed/stable per source value so "Rashi Patil" doesn't become three different fakes in one file.</w:t>
-      </w:r>
-    </w:p>
-    <w:p>
-      <w:pPr>
-        <w:pStyle w:val="Heading2"/>
-      </w:pPr>
-      <w:r>
-        <w:t>Evaluation (accuracy / precision / recall)</w:t>
+        <w:t>Numbers I can defend</w:t>
       </w:r>
     </w:p>
     <w:p>
@@ -663,12 +469,12 @@
         <w:pStyle w:val="Heading3"/>
       </w:pPr>
       <w:r>
-        <w:t>Controlled labelled set (python redact_pii.py --evaluate)</w:t>
+        <w:t>Small labelled suite (python redact_pii.py --evaluate)</w:t>
       </w:r>
     </w:p>
     <w:p>
       <w:r>
-        <w:t>14 cases: every required PII type once (or more for names), plus negatives like offer dates, CIN-style IDs, order numbers, generic business phrasing.</w:t>
+        <w:t>I wrote 14 fixed cases: every required type shows up, plus stuff that should not get nuked (plain offer dates, CIN-looking IDs, order numbers, bland corporate phrasing).</w:t>
       </w:r>
     </w:p>
     <w:tbl>
@@ -860,7 +666,7 @@
     </w:tbl>
     <w:p>
       <w:r>
-        <w:t>Be clear with graders: this is the unit suite, not "I labelled every paragraph of the prospectus by hand." It's there to prove each category fires and ticket-ish noise doesn't.</w:t>
+        <w:t>Important: this is my unit check, not "I hand-labelled the whole prospectus." Don't read it as perfect real-world performance.</w:t>
       </w:r>
     </w:p>
     <w:p>
@@ -868,12 +674,56 @@
         <w:pStyle w:val="Heading3"/>
       </w:pPr>
       <w:r>
-        <w:t>Prospectus run (assignment DOCX)</w:t>
+        <w:t>Prospectus</w:t>
       </w:r>
     </w:p>
     <w:p>
       <w:r>
-        <w:t>Latest local Rules run on the Red Herring Prospectus:</w:t>
+        <w:t>On the assignment file (Rules), last run I logged: 229 paragraphs touched, 347 replacements, 174 unique originals. Mix was mostly company/email/name/address/phone. That particular doc didn't throw SSN/card/DOB/IP at me; those still pass in the unit suite.</w:t>
+      </w:r>
+    </w:p>
+    <w:p>
+      <w:pPr>
+        <w:pStyle w:val="Heading3"/>
+      </w:pPr>
+      <w:r>
+        <w:t>Extra checks</w:t>
+      </w:r>
+    </w:p>
+    <w:p>
+      <w:r>
+        <w:t>generic_docx_test.py — three homemade layouts (ticket, HR table, split runs). Seeded PII gone, control ticket-ish IDs kept.</w:t>
+      </w:r>
+    </w:p>
+    <w:p>
+      <w:r>
+        <w:t>ml_ner_test.py — proves hybrid ≠ rules on unlabelled prose.</w:t>
+      </w:r>
+    </w:p>
+    <w:p>
+      <w:pPr>
+        <w:pStyle w:val="Heading2"/>
+      </w:pPr>
+      <w:r>
+        <w:t>What still hurts / what I'd do next</w:t>
+      </w:r>
+    </w:p>
+    <w:p>
+      <w:r>
+        <w:t>Rules miss bare names. Hybrid helps, but en_core_web_sm is general English — legal prospectus wording can still dodge it, and if I crank NER too hard I'll start eating random Title Case junk. Addresses across weird line breaks are still annoying. Free cloud for spaCy didn't work out for me, so local is the real ML path.</w:t>
+      </w:r>
+    </w:p>
+    <w:p>
+      <w:r>
+        <w:t>If this were production, I'd sample real pages, have someone label them, then tune — maybe a domain NER later. Right now it's a solid assignment tool, not a compliance product.</w:t>
+      </w:r>
+    </w:p>
+    <w:p>
+      <w:pPr>
+        <w:pStyle w:val="Heading2"/>
+      </w:pPr>
+      <w:r>
+        <w:t>What to open when grading</w:t>
       </w:r>
     </w:p>
     <w:p>
@@ -881,115 +731,7 @@
         <w:pStyle w:val="ListBullet"/>
       </w:pPr>
       <w:r>
-        <w:t>229 paragraphs changed</w:t>
-      </w:r>
-    </w:p>
-    <w:p>
-      <w:pPr>
-        <w:pStyle w:val="ListBullet"/>
-      </w:pPr>
-      <w:r>
-        <w:t>347 redactionsions</w:t>
-      </w:r>
-    </w:p>
-    <w:p>
-      <w:pPr>
-        <w:pStyle w:val="ListBullet"/>
-      </w:pPr>
-      <w:r>
-        <w:t>174 unique source values</w:t>
-      </w:r>
-    </w:p>
-    <w:p>
-      <w:r>
-        <w:t>Breakdown I saw: addresses 48, companies 169, emails 50, names 62, phones 18. No SSN / Luhn card / labelled DOB / IPv4 showed up in that particular doc — those still pass in the controlled suite.</w:t>
-      </w:r>
-    </w:p>
-    <w:p>
-      <w:pPr>
-        <w:pStyle w:val="Heading3"/>
-      </w:pPr>
-      <w:r>
-        <w:t>Generic regression (generic_docx_test.py)</w:t>
-      </w:r>
-    </w:p>
-    <w:p>
-      <w:r>
-        <w:t>Three made-up DOCX layouts (support ticket, HR table + header/footer, run-split text). Seeded PII gone, control IDs kept. So it's not a one-document hack.</w:t>
-      </w:r>
-    </w:p>
-    <w:p>
-      <w:pPr>
-        <w:pStyle w:val="Heading3"/>
-      </w:pPr>
-      <w:r>
-        <w:t>ML switch proof (ml_ner_test.py)</w:t>
-      </w:r>
-    </w:p>
-    <w:p>
-      <w:r>
-        <w:t>Already covered above — hybrid adds the three unlabelled entities Rules skipped.</w:t>
-      </w:r>
-    </w:p>
-    <w:p>
-      <w:pPr>
-        <w:pStyle w:val="Heading2"/>
-      </w:pPr>
-      <w:r>
-        <w:t>Trade-offs (being frank)</w:t>
-      </w:r>
-    </w:p>
-    <w:p>
-      <w:pPr>
-        <w:pStyle w:val="ListBullet"/>
-      </w:pPr>
-      <w:r>
-        <w:t>Rules win on structured PII and explainability. They lose when someone writes a name with no label.</w:t>
-      </w:r>
-    </w:p>
-    <w:p>
-      <w:pPr>
-        <w:pStyle w:val="ListBullet"/>
-      </w:pPr>
-      <w:r>
-        <w:t>Hybrid improves that recall, but pretrained NER is general English — prospectus legalese and odd org styles can still slip, and over-eager NER can invent false names if you loosen it too much. I kept it conservative.</w:t>
-      </w:r>
-    </w:p>
-    <w:p>
-      <w:pPr>
-        <w:pStyle w:val="ListBullet"/>
-      </w:pPr>
-      <w:r>
-        <w:t>Addresses are messy. Multi-line / weird formatting is still the soft spot.</w:t>
-      </w:r>
-    </w:p>
-    <w:p>
-      <w:pPr>
-        <w:pStyle w:val="ListBullet"/>
-      </w:pPr>
-      <w:r>
-        <w:t>Live static demo ≠ full stack. If you need to see ML live, run it locally. I tried free cloud for spaCy; it wasn't worth the broken deploys.</w:t>
-      </w:r>
-    </w:p>
-    <w:p>
-      <w:r>
-        <w:t>For a production follow-up I'd want a human-labelled sample from real docs, then tune patterns / maybe a domain NER. Not claiming this is bank-grade redaction.</w:t>
-      </w:r>
-    </w:p>
-    <w:p>
-      <w:pPr>
-        <w:pStyle w:val="Heading2"/>
-      </w:pPr>
-      <w:r>
-        <w:t>What's in the repo (submit these)</w:t>
-      </w:r>
-    </w:p>
-    <w:p>
-      <w:pPr>
-        <w:pStyle w:val="ListBullet"/>
-      </w:pPr>
-      <w:r>
-        <w:t>Source: redact_pii.py (+ web_app.py / web/ if you care about the UI)</w:t>
+        <w:t>Code: repo above (redact_pii.py)</w:t>
       </w:r>
     </w:p>
     <w:p>
@@ -1005,7 +747,7 @@
         <w:pStyle w:val="ListBullet"/>
       </w:pPr>
       <w:r>
-        <w:t>This document + README.md</w:t>
+        <w:t>This write-up</w:t>
       </w:r>
     </w:p>
     <w:p>
@@ -1013,50 +755,17 @@
         <w:pStyle w:val="ListBullet"/>
       </w:pPr>
       <w:r>
-        <w:t>EVALUATION_REPORT.md for the formal metrics sheet</w:t>
+        <w:t>EVALUATION_REPORT.md if you want the shorter metrics sheet</w:t>
       </w:r>
     </w:p>
     <w:p>
       <w:r>
-        <w:t>Links should be public / "anyone with the link". Repo is public. Live Space link is above.</w:t>
-      </w:r>
-    </w:p>
-    <w:p>
-      <w:pPr>
-        <w:pStyle w:val="Heading2"/>
-      </w:pPr>
-      <w:r>
-        <w:t>Quick rerun checklist</w:t>
+        <w:t>Rerun: python redact_pii.py --evaluate / manual_test.py / generic_docx_test.py / ml_ner_test.py</w:t>
       </w:r>
     </w:p>
     <w:p>
       <w:r>
-        <w:t>python redact_pii.py --evaluate</w:t>
-      </w:r>
-    </w:p>
-    <w:p>
-      <w:r>
-        <w:t>python manual_test.py</w:t>
-      </w:r>
-    </w:p>
-    <w:p>
-      <w:r>
-        <w:t>python generic_docx_test.py</w:t>
-      </w:r>
-    </w:p>
-    <w:p>
-      <w:r>
-        <w:t>python ml_ner_test.py</w:t>
-      </w:r>
-    </w:p>
-    <w:p>
-      <w:r>
-        <w:t>python redact_pii.py "Red Herring Prospectus.docx" "Red Herring Prospectus - Redacted.docx"</w:t>
-      </w:r>
-    </w:p>
-    <w:p>
-      <w:r>
-        <w:t>That's the whole story: Rules for the solid baseline, spaCy when prose names/orgs matter, and an honest live demo that doesn't fake ML when the host can't run it.</w:t>
+        <w:t>I built this for the Scaler brief: fake replacements, the nine PII buckets, measurable precision/recall on my suite, and an honest split between the static demo and the local spaCy switch.</w:t>
       </w:r>
     </w:p>
     <w:sectPr>

</xml_diff>

<commit_message>
Replace claimed prospectus stats with live-verified metrics only.
Co-authored-by: Cursor <cursoragent@cursor.com>
</commit_message>
<xml_diff>
--- a/SUBMISSION.docx
+++ b/SUBMISSION.docx
@@ -27,7 +27,7 @@
     </w:p>
     <w:p>
       <w:r>
-        <w:t>I'm submitting this for the Scaler AI Labs PII redaction task. Below is how I solved it — not a generic tutorial rewrite.</w:t>
+        <w:t>I'm submitting this for the Scaler AI Labs PII redaction task. Numbers below were re-checked with python verify_metrics.py on 18 Jul 2026 (examples/verified_metrics.json).</w:t>
       </w:r>
     </w:p>
     <w:p>
@@ -45,79 +45,7 @@
     </w:p>
     <w:p>
       <w:r>
-        <w:t>I cover at least:</w:t>
-      </w:r>
-    </w:p>
-    <w:p>
-      <w:pPr>
-        <w:pStyle w:val="ListBullet"/>
-      </w:pPr>
-      <w:r>
-        <w:t>names</w:t>
-      </w:r>
-    </w:p>
-    <w:p>
-      <w:pPr>
-        <w:pStyle w:val="ListBullet"/>
-      </w:pPr>
-      <w:r>
-        <w:t>emails</w:t>
-      </w:r>
-    </w:p>
-    <w:p>
-      <w:pPr>
-        <w:pStyle w:val="ListBullet"/>
-      </w:pPr>
-      <w:r>
-        <w:t>phones</w:t>
-      </w:r>
-    </w:p>
-    <w:p>
-      <w:pPr>
-        <w:pStyle w:val="ListBullet"/>
-      </w:pPr>
-      <w:r>
-        <w:t>companies</w:t>
-      </w:r>
-    </w:p>
-    <w:p>
-      <w:pPr>
-        <w:pStyle w:val="ListBullet"/>
-      </w:pPr>
-      <w:r>
-        <w:t>addresses</w:t>
-      </w:r>
-    </w:p>
-    <w:p>
-      <w:pPr>
-        <w:pStyle w:val="ListBullet"/>
-      </w:pPr>
-      <w:r>
-        <w:t>SSNs</w:t>
-      </w:r>
-    </w:p>
-    <w:p>
-      <w:pPr>
-        <w:pStyle w:val="ListBullet"/>
-      </w:pPr>
-      <w:r>
-        <w:t>cards (I check Luhn so random digit noise doesn't get wiped)</w:t>
-      </w:r>
-    </w:p>
-    <w:p>
-      <w:pPr>
-        <w:pStyle w:val="ListBullet"/>
-      </w:pPr>
-      <w:r>
-        <w:t>DOBs</w:t>
-      </w:r>
-    </w:p>
-    <w:p>
-      <w:pPr>
-        <w:pStyle w:val="ListBullet"/>
-      </w:pPr>
-      <w:r>
-        <w:t>IPs</w:t>
+        <w:t>I cover at least: names, emails, phones, companies, addresses, SSNs, cards (Luhn), DOBs, IPs.</w:t>
       </w:r>
     </w:p>
     <w:p>
@@ -132,7 +60,12 @@
     </w:p>
     <w:p>
       <w:r>
-        <w:t>Optional UI when I'm testing modes: web_app.py</w:t>
+        <w:t>Optional UI: web_app.py</w:t>
+      </w:r>
+    </w:p>
+    <w:p>
+      <w:r>
+        <w:t>I do not redact order/ticket/CIN-style IDs. That's a deliberate precision choice.</w:t>
       </w:r>
     </w:p>
     <w:p>
@@ -145,38 +78,12 @@
     </w:p>
     <w:p>
       <w:r>
-        <w:t>I didn't bet everything on one approach.</w:t>
-      </w:r>
-    </w:p>
-    <w:p>
-      <w:pPr>
-        <w:pStyle w:val="Heading3"/>
-      </w:pPr>
-      <w:r>
-        <w:t>Rules</w:t>
+        <w:t>Rules — regexes + labels I care about (Contact Person, DOB, Registered Office, Ltd/LLC endings, label→value table cells). Good for structured PII; I can usually explain each hit.</w:t>
       </w:r>
     </w:p>
     <w:p>
       <w:r>
-        <w:t>Regexes plus labels I care about (Contact Person, DOB, Registered Office, Ltd/LLC-style company endings, adjacent table cells that look like label → value). This is what I trust for emails, phones, SSN patterns, cards, IPs, labelled dates. When something gets replaced, I can usually explain why.</w:t>
-      </w:r>
-    </w:p>
-    <w:p>
-      <w:pPr>
-        <w:pStyle w:val="Heading3"/>
-      </w:pPr>
-      <w:r>
-        <w:t>Hybrid (ML / NER)</w:t>
-      </w:r>
-    </w:p>
-    <w:p>
-      <w:r>
-        <w:t>Keep those rules, then run spaCy's en_core_web_sm on top. I added this because plain rules ignore names/companies sitting in normal sentences with no Name: prefix. My check file has Alice Johnson, Robert Chen, and Microsoft in prose. Rules only clean the email/phone. Hybrid also hits the three unlabelled ones. That's what ml_ner_test.py is for — so nobody thinks the UI toggle is fake.</w:t>
-      </w:r>
-    </w:p>
-    <w:p>
-      <w:r>
-        <w:t>Same fake for the same original value inside one run (hash-based mapping). I don't ship the mapping file; that would leak the originals.</w:t>
+        <w:t>Hybrid (ML / NER) — rules + spaCy en_core_web_sm. Added because rules ignore bare names/companies in prose. Verified: Rules = 2 hits (email+phone); Hybrid = 5 (adds Alice Johnson, Robert Chen, Microsoft). See ml_ner_test.py.</w:t>
       </w:r>
     </w:p>
     <w:tbl>
@@ -206,7 +113,7 @@
           </w:tcPr>
           <w:p>
             <w:r>
-              <w:t>On my ML fixture</w:t>
+              <w:t>ml_ner_test.py (live)</w:t>
             </w:r>
           </w:p>
         </w:tc>
@@ -228,7 +135,7 @@
           </w:tcPr>
           <w:p>
             <w:r>
-              <w:t>email + phone (2)</w:t>
+              <w:t>2 redactions (email + phone)</w:t>
             </w:r>
           </w:p>
         </w:tc>
@@ -250,7 +157,7 @@
           </w:tcPr>
           <w:p>
             <w:r>
-              <w:t>email + phone + 2 names + Microsoft (5)</w:t>
+              <w:t>5 redactions (+ 2 names + Microsoft)</w:t>
             </w:r>
           </w:p>
         </w:tc>
@@ -266,7 +173,7 @@
     </w:p>
     <w:p>
       <w:r>
-        <w:t>Rules run (structured fields go; loose prose names stay):</w:t>
+        <w:t>Rules:</w:t>
       </w:r>
     </w:p>
     <w:p>
@@ -310,7 +217,7 @@
     </w:p>
     <w:p>
       <w:r>
-        <w:t>Hybrid run (spaCy picks up the loose names/org too):</w:t>
+        <w:t>Hybrid:</w:t>
       </w:r>
     </w:p>
     <w:p>
@@ -357,17 +264,12 @@
         <w:pStyle w:val="Heading2"/>
       </w:pPr>
       <w:r>
-        <w:t>Live demo vs local (don't get confused)</w:t>
+        <w:t>Live demo vs local</w:t>
       </w:r>
     </w:p>
     <w:p>
       <w:r>
-        <w:t>The Hugging Face link is a static Space. Browser only. No Python, so no spaCy there. I tried free Gradio/Docker on HF — that needs PRO now. I also tried Render; build/RAM issues on the big prospectus weren't worth fighting for a free host.</w:t>
-      </w:r>
-    </w:p>
-    <w:p>
-      <w:r>
-        <w:t>So the live page shows Rules, and ML is intentionally off. I'm not labelling it as "full ML online" when it isn't.</w:t>
+        <w:t>HF Space is static → no Python spaCy → ML toggle stays off on purpose.</w:t>
       </w:r>
     </w:p>
     <w:p>
@@ -411,12 +313,7 @@
     </w:p>
     <w:p>
       <w:r>
-        <w:t>To actually flip Rules ↔ ML: pip install -r requirements.txt then python web_app.py</w:t>
-      </w:r>
-    </w:p>
-    <w:p>
-      <w:r>
-        <w:t>Or CLI: python redact_pii.py --mode hybrid in.docx out.docx</w:t>
+        <w:t>Local: pip install -r requirements.txt then python web_app.py</w:t>
       </w:r>
     </w:p>
     <w:p>
@@ -424,44 +321,7 @@
         <w:pStyle w:val="Heading2"/>
       </w:pPr>
       <w:r>
-        <w:t>Libraries I used</w:t>
-      </w:r>
-    </w:p>
-    <w:p>
-      <w:pPr>
-        <w:pStyle w:val="ListBullet"/>
-      </w:pPr>
-      <w:r>
-        <w:t>python-docx — read/write the Word structure</w:t>
-      </w:r>
-    </w:p>
-    <w:p>
-      <w:pPr>
-        <w:pStyle w:val="ListBullet"/>
-      </w:pPr>
-      <w:r>
-        <w:t>regex / context rules — structured PII</w:t>
-      </w:r>
-    </w:p>
-    <w:p>
-      <w:pPr>
-        <w:pStyle w:val="ListBullet"/>
-      </w:pPr>
-      <w:r>
-        <w:t>spaCy + en_core_web_sm — extra PERSON/ORG recall in hybrid</w:t>
-      </w:r>
-    </w:p>
-    <w:p>
-      <w:r>
-        <w:t>That's it for the engine. No giant LLM API in the loop.</w:t>
-      </w:r>
-    </w:p>
-    <w:p>
-      <w:pPr>
-        <w:pStyle w:val="Heading2"/>
-      </w:pPr>
-      <w:r>
-        <w:t>Numbers I can defend</w:t>
+        <w:t>Verified evaluation numbers</w:t>
       </w:r>
     </w:p>
     <w:p>
@@ -469,12 +329,7 @@
         <w:pStyle w:val="Heading3"/>
       </w:pPr>
       <w:r>
-        <w:t>Small labelled suite (python redact_pii.py --evaluate)</w:t>
-      </w:r>
-    </w:p>
-    <w:p>
-      <w:r>
-        <w:t>I wrote 14 fixed cases: every required type shows up, plus stuff that should not get nuked (plain offer dates, CIN-looking IDs, order numbers, bland corporate phrasing).</w:t>
+        <w:t>Accuracy / precision / recall (redact_pii.py --evaluate)</w:t>
       </w:r>
     </w:p>
     <w:tbl>
@@ -504,7 +359,29 @@
           </w:tcPr>
           <w:p>
             <w:r>
-              <w:t>Result</w:t>
+              <w:t>Value</w:t>
+            </w:r>
+          </w:p>
+        </w:tc>
+      </w:tr>
+      <w:tr>
+        <w:tc>
+          <w:tcPr>
+            <w:tcW w:type="dxa" w:w="4320"/>
+          </w:tcPr>
+          <w:p>
+            <w:r>
+              <w:t>Cases</w:t>
+            </w:r>
+          </w:p>
+        </w:tc>
+        <w:tc>
+          <w:tcPr>
+            <w:tcW w:type="dxa" w:w="4320"/>
+          </w:tcPr>
+          <w:p>
+            <w:r>
+              <w:t>14</w:t>
             </w:r>
           </w:p>
         </w:tc>
@@ -614,7 +491,7 @@
           </w:tcPr>
           <w:p>
             <w:r>
-              <w:t>100%</w:t>
+              <w:t>100.0%</w:t>
             </w:r>
           </w:p>
         </w:tc>
@@ -636,7 +513,7 @@
           </w:tcPr>
           <w:p>
             <w:r>
-              <w:t>100%</w:t>
+              <w:t>100.0%</w:t>
             </w:r>
           </w:p>
         </w:tc>
@@ -658,7 +535,7 @@
           </w:tcPr>
           <w:p>
             <w:r>
-              <w:t>100%</w:t>
+              <w:t>100.0%</w:t>
             </w:r>
           </w:p>
         </w:tc>
@@ -666,7 +543,7 @@
     </w:tbl>
     <w:p>
       <w:r>
-        <w:t>Important: this is my unit check, not "I hand-labelled the whole prospectus." Don't read it as perfect real-world performance.</w:t>
+        <w:t>Unit suite only — not "I labelled the whole prospectus by hand."</w:t>
       </w:r>
     </w:p>
     <w:p>
@@ -674,12 +551,31 @@
         <w:pStyle w:val="Heading3"/>
       </w:pPr>
       <w:r>
-        <w:t>Prospectus</w:t>
+        <w:t>Other live checks</w:t>
       </w:r>
     </w:p>
     <w:p>
+      <w:pPr>
+        <w:pStyle w:val="ListBullet"/>
+      </w:pPr>
       <w:r>
-        <w:t>On the assignment file (Rules), last run I logged: 229 paragraphs touched, 347 replacements, 174 unique originals. Mix was mostly company/email/name/address/phone. That particular doc didn't throw SSN/card/DOB/IP at me; those still pass in the unit suite.</w:t>
+        <w:t>manual_test.py — passed (all 9 types)</w:t>
+      </w:r>
+    </w:p>
+    <w:p>
+      <w:pPr>
+        <w:pStyle w:val="ListBullet"/>
+      </w:pPr>
+      <w:r>
+        <w:t>generic_docx_test.py — passed (3 layouts)</w:t>
+      </w:r>
+    </w:p>
+    <w:p>
+      <w:pPr>
+        <w:pStyle w:val="ListBullet"/>
+      </w:pPr>
+      <w:r>
+        <w:t>ml_ner_test.py — passed (Rules 2 vs Hybrid 5)</w:t>
       </w:r>
     </w:p>
     <w:p>
@@ -687,17 +583,155 @@
         <w:pStyle w:val="Heading3"/>
       </w:pPr>
       <w:r>
-        <w:t>Extra checks</w:t>
+        <w:t>What's inside the submitted redacted prospectus (counted today)</w:t>
       </w:r>
     </w:p>
+    <w:tbl>
+      <w:tblPr>
+        <w:tblStyle w:val="TableGrid"/>
+        <w:tblW w:type="auto" w:w="0"/>
+        <w:tblLook w:firstColumn="1" w:firstRow="1" w:lastColumn="0" w:lastRow="0" w:noHBand="0" w:noVBand="1" w:val="04A0"/>
+      </w:tblPr>
+      <w:tblGrid>
+        <w:gridCol w:w="4320"/>
+        <w:gridCol w:w="4320"/>
+      </w:tblGrid>
+      <w:tr>
+        <w:tc>
+          <w:tcPr>
+            <w:tcW w:type="dxa" w:w="4320"/>
+          </w:tcPr>
+          <w:p>
+            <w:r>
+              <w:t>Marker</w:t>
+            </w:r>
+          </w:p>
+        </w:tc>
+        <w:tc>
+          <w:tcPr>
+            <w:tcW w:type="dxa" w:w="4320"/>
+          </w:tcPr>
+          <w:p>
+            <w:r>
+              <w:t>Count</w:t>
+            </w:r>
+          </w:p>
+        </w:tc>
+      </w:tr>
+      <w:tr>
+        <w:tc>
+          <w:tcPr>
+            <w:tcW w:type="dxa" w:w="4320"/>
+          </w:tcPr>
+          <w:p>
+            <w:r>
+              <w:t>Non-empty paragraphs</w:t>
+            </w:r>
+          </w:p>
+        </w:tc>
+        <w:tc>
+          <w:tcPr>
+            <w:tcW w:type="dxa" w:w="4320"/>
+          </w:tcPr>
+          <w:p>
+            <w:r>
+              <w:t>694</w:t>
+            </w:r>
+          </w:p>
+        </w:tc>
+      </w:tr>
+      <w:tr>
+        <w:tc>
+          <w:tcPr>
+            <w:tcW w:type="dxa" w:w="4320"/>
+          </w:tcPr>
+          <w:p>
+            <w:r>
+              <w:t>@example.com emails</w:t>
+            </w:r>
+          </w:p>
+        </w:tc>
+        <w:tc>
+          <w:tcPr>
+            <w:tcW w:type="dxa" w:w="4320"/>
+          </w:tcPr>
+          <w:p>
+            <w:r>
+              <w:t>38</w:t>
+            </w:r>
+          </w:p>
+        </w:tc>
+      </w:tr>
+      <w:tr>
+        <w:tc>
+          <w:tcPr>
+            <w:tcW w:type="dxa" w:w="4320"/>
+          </w:tcPr>
+          <w:p>
+            <w:r>
+              <w:t>Example Entity … Limited</w:t>
+            </w:r>
+          </w:p>
+        </w:tc>
+        <w:tc>
+          <w:tcPr>
+            <w:tcW w:type="dxa" w:w="4320"/>
+          </w:tcPr>
+          <w:p>
+            <w:r>
+              <w:t>77</w:t>
+            </w:r>
+          </w:p>
+        </w:tc>
+      </w:tr>
+      <w:tr>
+        <w:tc>
+          <w:tcPr>
+            <w:tcW w:type="dxa" w:w="4320"/>
+          </w:tcPr>
+          <w:p>
+            <w:r>
+              <w:t>Example Avenue addresses</w:t>
+            </w:r>
+          </w:p>
+        </w:tc>
+        <w:tc>
+          <w:tcPr>
+            <w:tcW w:type="dxa" w:w="4320"/>
+          </w:tcPr>
+          <w:p>
+            <w:r>
+              <w:t>27</w:t>
+            </w:r>
+          </w:p>
+        </w:tc>
+      </w:tr>
+      <w:tr>
+        <w:tc>
+          <w:tcPr>
+            <w:tcW w:type="dxa" w:w="4320"/>
+          </w:tcPr>
+          <w:p>
+            <w:r>
+              <w:t>Synthetic +91 phones</w:t>
+            </w:r>
+          </w:p>
+        </w:tc>
+        <w:tc>
+          <w:tcPr>
+            <w:tcW w:type="dxa" w:w="4320"/>
+          </w:tcPr>
+          <w:p>
+            <w:r>
+              <w:t>13</w:t>
+            </w:r>
+          </w:p>
+        </w:tc>
+      </w:tr>
+    </w:tbl>
     <w:p>
       <w:r>
-        <w:t>generic_docx_test.py — three homemade layouts (ticket, HR table, split runs). Seeded PII gone, control ticket-ish IDs kept.</w:t>
-      </w:r>
-    </w:p>
-    <w:p>
-      <w:r>
-        <w:t>ml_ner_test.py — proves hybrid ≠ rules on unlabelled prose.</w:t>
+        <w:t>Original file isn't in git. To reprint a full engine summary: python verify_metrics.py --prospectus "PATH\original.docx"</w:t>
       </w:r>
     </w:p>
     <w:p>
@@ -705,17 +739,12 @@
         <w:pStyle w:val="Heading2"/>
       </w:pPr>
       <w:r>
-        <w:t>What still hurts / what I'd do next</w:t>
+        <w:t>Trade-offs</w:t>
       </w:r>
     </w:p>
     <w:p>
       <w:r>
-        <w:t>Rules miss bare names. Hybrid helps, but en_core_web_sm is general English — legal prospectus wording can still dodge it, and if I crank NER too hard I'll start eating random Title Case junk. Addresses across weird line breaks are still annoying. Free cloud for spaCy didn't work out for me, so local is the real ML path.</w:t>
-      </w:r>
-    </w:p>
-    <w:p>
-      <w:r>
-        <w:t>If this were production, I'd sample real pages, have someone label them, then tune — maybe a domain NER later. Right now it's a solid assignment tool, not a compliance product.</w:t>
+        <w:t>Rules miss bare names; hybrid helps but isn't perfect on legalese. Weird multi-line addresses still hurt. Free cloud for spaCy didn't stick, so local is the real ML path.</w:t>
       </w:r>
     </w:p>
     <w:p>
@@ -723,7 +752,7 @@
         <w:pStyle w:val="Heading2"/>
       </w:pPr>
       <w:r>
-        <w:t>What to open when grading</w:t>
+        <w:t>Grading pack</w:t>
       </w:r>
     </w:p>
     <w:p>
@@ -731,7 +760,7 @@
         <w:pStyle w:val="ListBullet"/>
       </w:pPr>
       <w:r>
-        <w:t>Code: repo above (redact_pii.py)</w:t>
+        <w:t>Code — repo / redact_pii.py</w:t>
       </w:r>
     </w:p>
     <w:p>
@@ -739,7 +768,7 @@
         <w:pStyle w:val="ListBullet"/>
       </w:pPr>
       <w:r>
-        <w:t>Output: Red Herring Prospectus - Redacted.docx</w:t>
+        <w:t>Output — Red Herring Prospectus - Redacted.docx</w:t>
       </w:r>
     </w:p>
     <w:p>
@@ -747,7 +776,7 @@
         <w:pStyle w:val="ListBullet"/>
       </w:pPr>
       <w:r>
-        <w:t>This write-up</w:t>
+        <w:t>This note + EVALUATION_REPORT.md</w:t>
       </w:r>
     </w:p>
     <w:p>
@@ -755,17 +784,7 @@
         <w:pStyle w:val="ListBullet"/>
       </w:pPr>
       <w:r>
-        <w:t>EVALUATION_REPORT.md if you want the shorter metrics sheet</w:t>
-      </w:r>
-    </w:p>
-    <w:p>
-      <w:r>
-        <w:t>Rerun: python redact_pii.py --evaluate / manual_test.py / generic_docx_test.py / ml_ner_test.py</w:t>
-      </w:r>
-    </w:p>
-    <w:p>
-      <w:r>
-        <w:t>I built this for the Scaler brief: fake replacements, the nine PII buckets, measurable precision/recall on my suite, and an honest split between the static demo and the local spaCy switch.</w:t>
+        <w:t>Recompute — python verify_metrics.py</w:t>
       </w:r>
     </w:p>
     <w:sectPr>

</xml_diff>

<commit_message>
Update prospectus metrics from live Desktop original re-run.
Co-authored-by: Cursor <cursoragent@cursor.com>
</commit_message>
<xml_diff>
--- a/SUBMISSION.docx
+++ b/SUBMISSION.docx
@@ -583,7 +583,7 @@
         <w:pStyle w:val="Heading3"/>
       </w:pPr>
       <w:r>
-        <w:t>What's inside the submitted redacted prospectus (counted today)</w:t>
+        <w:t>Prospectus (live Rules run, 18 Jul 2026)</w:t>
       </w:r>
     </w:p>
     <w:tbl>
@@ -603,7 +603,7 @@
           </w:tcPr>
           <w:p>
             <w:r>
-              <w:t>Marker</w:t>
+              <w:t>Metric</w:t>
             </w:r>
           </w:p>
         </w:tc>
@@ -613,7 +613,7 @@
           </w:tcPr>
           <w:p>
             <w:r>
-              <w:t>Count</w:t>
+              <w:t>Value</w:t>
             </w:r>
           </w:p>
         </w:tc>
@@ -625,7 +625,7 @@
           </w:tcPr>
           <w:p>
             <w:r>
-              <w:t>Non-empty paragraphs</w:t>
+              <w:t>Changed paragraphs</w:t>
             </w:r>
           </w:p>
         </w:tc>
@@ -635,7 +635,7 @@
           </w:tcPr>
           <w:p>
             <w:r>
-              <w:t>694</w:t>
+              <w:t>255</w:t>
             </w:r>
           </w:p>
         </w:tc>
@@ -647,7 +647,7 @@
           </w:tcPr>
           <w:p>
             <w:r>
-              <w:t>@example.com emails</w:t>
+              <w:t>Unique replacements</w:t>
             </w:r>
           </w:p>
         </w:tc>
@@ -657,7 +657,7 @@
           </w:tcPr>
           <w:p>
             <w:r>
-              <w:t>38</w:t>
+              <w:t>187</w:t>
             </w:r>
           </w:p>
         </w:tc>
@@ -669,7 +669,7 @@
           </w:tcPr>
           <w:p>
             <w:r>
-              <w:t>Example Entity … Limited</w:t>
+              <w:t>Total redactions</w:t>
             </w:r>
           </w:p>
         </w:tc>
@@ -679,7 +679,7 @@
           </w:tcPr>
           <w:p>
             <w:r>
-              <w:t>77</w:t>
+              <w:t>373</w:t>
             </w:r>
           </w:p>
         </w:tc>
@@ -691,7 +691,7 @@
           </w:tcPr>
           <w:p>
             <w:r>
-              <w:t>Example Avenue addresses</w:t>
+              <w:t>company</w:t>
             </w:r>
           </w:p>
         </w:tc>
@@ -701,7 +701,7 @@
           </w:tcPr>
           <w:p>
             <w:r>
-              <w:t>27</w:t>
+              <w:t>188</w:t>
             </w:r>
           </w:p>
         </w:tc>
@@ -713,7 +713,7 @@
           </w:tcPr>
           <w:p>
             <w:r>
-              <w:t>Synthetic +91 phones</w:t>
+              <w:t>name</w:t>
             </w:r>
           </w:p>
         </w:tc>
@@ -723,7 +723,73 @@
           </w:tcPr>
           <w:p>
             <w:r>
-              <w:t>13</w:t>
+              <w:t>62</w:t>
+            </w:r>
+          </w:p>
+        </w:tc>
+      </w:tr>
+      <w:tr>
+        <w:tc>
+          <w:tcPr>
+            <w:tcW w:type="dxa" w:w="4320"/>
+          </w:tcPr>
+          <w:p>
+            <w:r>
+              <w:t>email</w:t>
+            </w:r>
+          </w:p>
+        </w:tc>
+        <w:tc>
+          <w:tcPr>
+            <w:tcW w:type="dxa" w:w="4320"/>
+          </w:tcPr>
+          <w:p>
+            <w:r>
+              <w:t>50</w:t>
+            </w:r>
+          </w:p>
+        </w:tc>
+      </w:tr>
+      <w:tr>
+        <w:tc>
+          <w:tcPr>
+            <w:tcW w:type="dxa" w:w="4320"/>
+          </w:tcPr>
+          <w:p>
+            <w:r>
+              <w:t>address</w:t>
+            </w:r>
+          </w:p>
+        </w:tc>
+        <w:tc>
+          <w:tcPr>
+            <w:tcW w:type="dxa" w:w="4320"/>
+          </w:tcPr>
+          <w:p>
+            <w:r>
+              <w:t>49</w:t>
+            </w:r>
+          </w:p>
+        </w:tc>
+      </w:tr>
+      <w:tr>
+        <w:tc>
+          <w:tcPr>
+            <w:tcW w:type="dxa" w:w="4320"/>
+          </w:tcPr>
+          <w:p>
+            <w:r>
+              <w:t>phone</w:t>
+            </w:r>
+          </w:p>
+        </w:tc>
+        <w:tc>
+          <w:tcPr>
+            <w:tcW w:type="dxa" w:w="4320"/>
+          </w:tcPr>
+          <w:p>
+            <w:r>
+              <w:t>24</w:t>
             </w:r>
           </w:p>
         </w:tc>
@@ -731,7 +797,7 @@
     </w:tbl>
     <w:p>
       <w:r>
-        <w:t>Original file isn't in git. To reprint a full engine summary: python verify_metrics.py --prospectus "PATH\original.docx"</w:t>
+        <w:t>No SSN/card/DOB/IP in this particular file (still covered by the unit suite). Evidence: verified_metrics.json.</w:t>
       </w:r>
     </w:p>
     <w:p>

</xml_diff>

<commit_message>
Keep UI screenshots in README and SUBMISSION docs.
Co-authored-by: Cursor <cursoragent@cursor.com>
</commit_message>
<xml_diff>
--- a/SUBMISSION.docx
+++ b/SUBMISSION.docx
@@ -78,6 +78,19 @@
     </w:p>
     <w:p>
       <w:pPr>
+        <w:pStyle w:val="Heading3"/>
+      </w:pPr>
+      <w:r>
+        <w:t>Screenshots (kept)</w:t>
+      </w:r>
+    </w:p>
+    <w:p>
+      <w:r>
+        <w:t>Rules mode — local UI:</w:t>
+      </w:r>
+    </w:p>
+    <w:p>
+      <w:pPr>
         <w:jc w:val="center"/>
       </w:pPr>
       <w:r>
@@ -113,6 +126,11 @@
             </a:graphic>
           </wp:inline>
         </w:drawing>
+      </w:r>
+    </w:p>
+    <w:p>
+      <w:r>
+        <w:t>ML / NER hybrid — local UI:</w:t>
       </w:r>
     </w:p>
     <w:p>
@@ -156,7 +174,7 @@
     </w:p>
     <w:p>
       <w:r>
-        <w:t>HF live Space is static → ML disabled on purpose:</w:t>
+        <w:t>HF live Space — ML disabled on purpose (static demo):</w:t>
       </w:r>
     </w:p>
     <w:p>

</xml_diff>